<commit_message>
Game exported and placed in correct folder
</commit_message>
<xml_diff>
--- a/Opdracht-1/Logboek Game Development.docx
+++ b/Opdracht-1/Logboek Game Development.docx
@@ -781,10 +781,351 @@
     </w:p>
     <w:p>
       <w:pPr>
-        <w:rPr>
-          <w:lang w:val="nl-NL"/>
-        </w:rPr>
-      </w:pPr>
+        <w:pStyle w:val="NormalWeb"/>
+        <w:ind w:left="720"/>
+        <w:rPr>
+          <w:rFonts w:asciiTheme="minorHAnsi" w:hAnsiTheme="minorHAnsi"/>
+        </w:rPr>
+      </w:pPr>
+      <w:r>
+        <w:rPr>
+          <w:rFonts w:asciiTheme="minorHAnsi" w:hAnsiTheme="minorHAnsi"/>
+          <w:b/>
+          <w:bCs/>
+        </w:rPr>
+        <w:t>Dag 8 – 21/06/2025</w:t>
+      </w:r>
+    </w:p>
+    <w:p>
+      <w:pPr>
+        <w:pStyle w:val="NormalWeb"/>
+        <w:numPr>
+          <w:ilvl w:val="0"/>
+          <w:numId w:val="6"/>
+        </w:numPr>
+        <w:rPr>
+          <w:rFonts w:asciiTheme="minorHAnsi" w:hAnsiTheme="minorHAnsi"/>
+          <w:lang w:val="nl-NL"/>
+        </w:rPr>
+      </w:pPr>
+      <w:r>
+        <w:rPr>
+          <w:rFonts w:asciiTheme="minorHAnsi" w:hAnsiTheme="minorHAnsi"/>
+          <w:lang w:val="nl-NL"/>
+        </w:rPr>
+        <w:t>Na het terugzetten van het werk de UI-schermen opnieuw opgebouwd.</w:t>
+      </w:r>
+    </w:p>
+    <w:p>
+      <w:pPr>
+        <w:pStyle w:val="NormalWeb"/>
+        <w:numPr>
+          <w:ilvl w:val="0"/>
+          <w:numId w:val="6"/>
+        </w:numPr>
+        <w:rPr>
+          <w:rFonts w:asciiTheme="minorHAnsi" w:hAnsiTheme="minorHAnsi"/>
+          <w:lang w:val="nl-NL"/>
+        </w:rPr>
+      </w:pPr>
+      <w:r>
+        <w:rPr>
+          <w:rFonts w:asciiTheme="minorHAnsi" w:hAnsiTheme="minorHAnsi"/>
+          <w:lang w:val="nl-NL"/>
+        </w:rPr>
+        <w:t xml:space="preserve">Instructie-knop toegevoegd om de “How </w:t>
+      </w:r>
+      <w:proofErr w:type="spellStart"/>
+      <w:r>
+        <w:rPr>
+          <w:rFonts w:asciiTheme="minorHAnsi" w:hAnsiTheme="minorHAnsi"/>
+          <w:lang w:val="nl-NL"/>
+        </w:rPr>
+        <w:t>to</w:t>
+      </w:r>
+      <w:proofErr w:type="spellEnd"/>
+      <w:r>
+        <w:rPr>
+          <w:rFonts w:asciiTheme="minorHAnsi" w:hAnsiTheme="minorHAnsi"/>
+          <w:lang w:val="nl-NL"/>
+        </w:rPr>
+        <w:t xml:space="preserve"> Play” uitleg te tonen.</w:t>
+      </w:r>
+    </w:p>
+    <w:p>
+      <w:pPr>
+        <w:pStyle w:val="NormalWeb"/>
+        <w:numPr>
+          <w:ilvl w:val="0"/>
+          <w:numId w:val="6"/>
+        </w:numPr>
+        <w:rPr>
+          <w:rFonts w:asciiTheme="minorHAnsi" w:hAnsiTheme="minorHAnsi"/>
+          <w:lang w:val="nl-NL"/>
+        </w:rPr>
+      </w:pPr>
+      <w:proofErr w:type="spellStart"/>
+      <w:r>
+        <w:rPr>
+          <w:rFonts w:asciiTheme="minorHAnsi" w:hAnsiTheme="minorHAnsi"/>
+          <w:lang w:val="nl-NL"/>
+        </w:rPr>
+        <w:t>Victory</w:t>
+      </w:r>
+      <w:proofErr w:type="spellEnd"/>
+      <w:r>
+        <w:rPr>
+          <w:rFonts w:asciiTheme="minorHAnsi" w:hAnsiTheme="minorHAnsi"/>
+          <w:lang w:val="nl-NL"/>
+        </w:rPr>
+        <w:t>-scherm gemaakt dat verschijnt zodra je het puntendoel bereikt.</w:t>
+      </w:r>
+    </w:p>
+    <w:p>
+      <w:pPr>
+        <w:pStyle w:val="NormalWeb"/>
+        <w:ind w:left="720"/>
+        <w:rPr>
+          <w:rFonts w:asciiTheme="minorHAnsi" w:hAnsiTheme="minorHAnsi"/>
+        </w:rPr>
+      </w:pPr>
+      <w:r>
+        <w:rPr>
+          <w:rFonts w:asciiTheme="minorHAnsi" w:hAnsiTheme="minorHAnsi"/>
+          <w:b/>
+          <w:bCs/>
+        </w:rPr>
+        <w:t>Dag 9 – 22/06/2025</w:t>
+      </w:r>
+    </w:p>
+    <w:p>
+      <w:pPr>
+        <w:pStyle w:val="NormalWeb"/>
+        <w:numPr>
+          <w:ilvl w:val="0"/>
+          <w:numId w:val="7"/>
+        </w:numPr>
+        <w:rPr>
+          <w:rFonts w:asciiTheme="minorHAnsi" w:hAnsiTheme="minorHAnsi"/>
+          <w:lang w:val="nl-NL"/>
+        </w:rPr>
+      </w:pPr>
+      <w:proofErr w:type="spellStart"/>
+      <w:r>
+        <w:rPr>
+          <w:rFonts w:asciiTheme="minorHAnsi" w:hAnsiTheme="minorHAnsi"/>
+          <w:lang w:val="nl-NL"/>
+        </w:rPr>
+        <w:t>Particle</w:t>
+      </w:r>
+      <w:proofErr w:type="spellEnd"/>
+      <w:r>
+        <w:rPr>
+          <w:rFonts w:asciiTheme="minorHAnsi" w:hAnsiTheme="minorHAnsi"/>
+          <w:lang w:val="nl-NL"/>
+        </w:rPr>
+        <w:t>-effect geïmplementeerd dat afgaat bij botsing met een obstakel.</w:t>
+      </w:r>
+    </w:p>
+    <w:p>
+      <w:pPr>
+        <w:pStyle w:val="NormalWeb"/>
+        <w:numPr>
+          <w:ilvl w:val="0"/>
+          <w:numId w:val="7"/>
+        </w:numPr>
+        <w:rPr>
+          <w:rFonts w:asciiTheme="minorHAnsi" w:hAnsiTheme="minorHAnsi"/>
+          <w:lang w:val="nl-NL"/>
+        </w:rPr>
+      </w:pPr>
+      <w:proofErr w:type="spellStart"/>
+      <w:r>
+        <w:rPr>
+          <w:rFonts w:asciiTheme="minorHAnsi" w:hAnsiTheme="minorHAnsi"/>
+          <w:lang w:val="nl-NL"/>
+        </w:rPr>
+        <w:t>AudioManager</w:t>
+      </w:r>
+      <w:proofErr w:type="spellEnd"/>
+      <w:r>
+        <w:rPr>
+          <w:rFonts w:asciiTheme="minorHAnsi" w:hAnsiTheme="minorHAnsi"/>
+          <w:lang w:val="nl-NL"/>
+        </w:rPr>
+        <w:t xml:space="preserve"> geschreven en toegevoegd, met aparte geluiden voor:</w:t>
+      </w:r>
+    </w:p>
+    <w:p>
+      <w:pPr>
+        <w:pStyle w:val="NormalWeb"/>
+        <w:numPr>
+          <w:ilvl w:val="1"/>
+          <w:numId w:val="7"/>
+        </w:numPr>
+        <w:rPr>
+          <w:rFonts w:asciiTheme="minorHAnsi" w:hAnsiTheme="minorHAnsi"/>
+        </w:rPr>
+      </w:pPr>
+      <w:r>
+        <w:rPr>
+          <w:rFonts w:asciiTheme="minorHAnsi" w:hAnsiTheme="minorHAnsi"/>
+        </w:rPr>
+        <w:t>Sprong</w:t>
+      </w:r>
+    </w:p>
+    <w:p>
+      <w:pPr>
+        <w:pStyle w:val="NormalWeb"/>
+        <w:numPr>
+          <w:ilvl w:val="1"/>
+          <w:numId w:val="7"/>
+        </w:numPr>
+        <w:rPr>
+          <w:rFonts w:asciiTheme="minorHAnsi" w:hAnsiTheme="minorHAnsi"/>
+        </w:rPr>
+      </w:pPr>
+      <w:r>
+        <w:rPr>
+          <w:rFonts w:asciiTheme="minorHAnsi" w:hAnsiTheme="minorHAnsi"/>
+        </w:rPr>
+        <w:t>Explosion (</w:t>
+      </w:r>
+      <w:proofErr w:type="spellStart"/>
+      <w:r>
+        <w:rPr>
+          <w:rFonts w:asciiTheme="minorHAnsi" w:hAnsiTheme="minorHAnsi"/>
+        </w:rPr>
+        <w:t>botsing</w:t>
+      </w:r>
+      <w:proofErr w:type="spellEnd"/>
+      <w:r>
+        <w:rPr>
+          <w:rFonts w:asciiTheme="minorHAnsi" w:hAnsiTheme="minorHAnsi"/>
+        </w:rPr>
+        <w:t>)</w:t>
+      </w:r>
+    </w:p>
+    <w:p>
+      <w:pPr>
+        <w:pStyle w:val="NormalWeb"/>
+        <w:numPr>
+          <w:ilvl w:val="1"/>
+          <w:numId w:val="7"/>
+        </w:numPr>
+        <w:rPr>
+          <w:rFonts w:asciiTheme="minorHAnsi" w:hAnsiTheme="minorHAnsi"/>
+        </w:rPr>
+      </w:pPr>
+      <w:r>
+        <w:rPr>
+          <w:rFonts w:asciiTheme="minorHAnsi" w:hAnsiTheme="minorHAnsi"/>
+        </w:rPr>
+        <w:t>Game Over</w:t>
+      </w:r>
+    </w:p>
+    <w:p>
+      <w:pPr>
+        <w:pStyle w:val="NormalWeb"/>
+        <w:numPr>
+          <w:ilvl w:val="1"/>
+          <w:numId w:val="7"/>
+        </w:numPr>
+        <w:rPr>
+          <w:rFonts w:asciiTheme="minorHAnsi" w:hAnsiTheme="minorHAnsi"/>
+        </w:rPr>
+      </w:pPr>
+      <w:r>
+        <w:rPr>
+          <w:rFonts w:asciiTheme="minorHAnsi" w:hAnsiTheme="minorHAnsi"/>
+        </w:rPr>
+        <w:t>Victory</w:t>
+      </w:r>
+    </w:p>
+    <w:p>
+      <w:pPr>
+        <w:pStyle w:val="NormalWeb"/>
+        <w:ind w:left="720"/>
+        <w:rPr>
+          <w:rFonts w:asciiTheme="minorHAnsi" w:hAnsiTheme="minorHAnsi"/>
+        </w:rPr>
+      </w:pPr>
+      <w:r>
+        <w:rPr>
+          <w:rFonts w:asciiTheme="minorHAnsi" w:hAnsiTheme="minorHAnsi"/>
+          <w:b/>
+          <w:bCs/>
+        </w:rPr>
+        <w:t>Dag 10 – 23/06/2025</w:t>
+      </w:r>
+    </w:p>
+    <w:p>
+      <w:pPr>
+        <w:pStyle w:val="NormalWeb"/>
+        <w:numPr>
+          <w:ilvl w:val="0"/>
+          <w:numId w:val="8"/>
+        </w:numPr>
+        <w:rPr>
+          <w:rFonts w:asciiTheme="minorHAnsi" w:hAnsiTheme="minorHAnsi"/>
+          <w:lang w:val="nl-NL"/>
+        </w:rPr>
+      </w:pPr>
+      <w:r>
+        <w:rPr>
+          <w:rFonts w:asciiTheme="minorHAnsi" w:hAnsiTheme="minorHAnsi"/>
+          <w:lang w:val="nl-NL"/>
+        </w:rPr>
+        <w:t xml:space="preserve">Alles </w:t>
+      </w:r>
+      <w:proofErr w:type="spellStart"/>
+      <w:r>
+        <w:rPr>
+          <w:rFonts w:asciiTheme="minorHAnsi" w:hAnsiTheme="minorHAnsi"/>
+          <w:lang w:val="nl-NL"/>
+        </w:rPr>
+        <w:t>dubbelgecheckt</w:t>
+      </w:r>
+      <w:proofErr w:type="spellEnd"/>
+      <w:r>
+        <w:rPr>
+          <w:rFonts w:asciiTheme="minorHAnsi" w:hAnsiTheme="minorHAnsi"/>
+          <w:lang w:val="nl-NL"/>
+        </w:rPr>
+        <w:t xml:space="preserve"> tegen de </w:t>
+      </w:r>
+      <w:proofErr w:type="spellStart"/>
+      <w:r>
+        <w:rPr>
+          <w:rFonts w:asciiTheme="minorHAnsi" w:hAnsiTheme="minorHAnsi"/>
+          <w:lang w:val="nl-NL"/>
+        </w:rPr>
+        <w:t>backlog</w:t>
+      </w:r>
+      <w:proofErr w:type="spellEnd"/>
+      <w:r>
+        <w:rPr>
+          <w:rFonts w:asciiTheme="minorHAnsi" w:hAnsiTheme="minorHAnsi"/>
+          <w:lang w:val="nl-NL"/>
+        </w:rPr>
+        <w:t>: alle “must have” en “</w:t>
+      </w:r>
+      <w:proofErr w:type="spellStart"/>
+      <w:r>
+        <w:rPr>
+          <w:rFonts w:asciiTheme="minorHAnsi" w:hAnsiTheme="minorHAnsi"/>
+          <w:lang w:val="nl-NL"/>
+        </w:rPr>
+        <w:t>should</w:t>
+      </w:r>
+      <w:proofErr w:type="spellEnd"/>
+      <w:r>
+        <w:rPr>
+          <w:rFonts w:asciiTheme="minorHAnsi" w:hAnsiTheme="minorHAnsi"/>
+          <w:lang w:val="nl-NL"/>
+        </w:rPr>
+        <w:t xml:space="preserve"> have” functionaliteiten zitten erin.</w:t>
+      </w:r>
     </w:p>
     <w:p>
       <w:r>
@@ -1105,6 +1446,304 @@
     </w:lvl>
   </w:abstractNum>
   <w:abstractNum w:abstractNumId="2" w15:restartNumberingAfterBreak="0">
+    <w:nsid w:val="363132C5"/>
+    <w:multiLevelType w:val="multilevel"/>
+    <w:tmpl w:val="DCC402AC"/>
+    <w:lvl w:ilvl="0">
+      <w:start w:val="1"/>
+      <w:numFmt w:val="bullet"/>
+      <w:lvlText w:val=""/>
+      <w:lvlJc w:val="left"/>
+      <w:pPr>
+        <w:tabs>
+          <w:tab w:val="num" w:pos="720"/>
+        </w:tabs>
+        <w:ind w:left="720" w:hanging="360"/>
+      </w:pPr>
+      <w:rPr>
+        <w:rFonts w:ascii="Symbol" w:hAnsi="Symbol" w:hint="default"/>
+        <w:sz w:val="20"/>
+      </w:rPr>
+    </w:lvl>
+    <w:lvl w:ilvl="1" w:tentative="1">
+      <w:start w:val="1"/>
+      <w:numFmt w:val="bullet"/>
+      <w:lvlText w:val="o"/>
+      <w:lvlJc w:val="left"/>
+      <w:pPr>
+        <w:tabs>
+          <w:tab w:val="num" w:pos="1440"/>
+        </w:tabs>
+        <w:ind w:left="1440" w:hanging="360"/>
+      </w:pPr>
+      <w:rPr>
+        <w:rFonts w:ascii="Courier New" w:hAnsi="Courier New" w:hint="default"/>
+        <w:sz w:val="20"/>
+      </w:rPr>
+    </w:lvl>
+    <w:lvl w:ilvl="2" w:tentative="1">
+      <w:start w:val="1"/>
+      <w:numFmt w:val="bullet"/>
+      <w:lvlText w:val=""/>
+      <w:lvlJc w:val="left"/>
+      <w:pPr>
+        <w:tabs>
+          <w:tab w:val="num" w:pos="2160"/>
+        </w:tabs>
+        <w:ind w:left="2160" w:hanging="360"/>
+      </w:pPr>
+      <w:rPr>
+        <w:rFonts w:ascii="Wingdings" w:hAnsi="Wingdings" w:hint="default"/>
+        <w:sz w:val="20"/>
+      </w:rPr>
+    </w:lvl>
+    <w:lvl w:ilvl="3" w:tentative="1">
+      <w:start w:val="1"/>
+      <w:numFmt w:val="bullet"/>
+      <w:lvlText w:val=""/>
+      <w:lvlJc w:val="left"/>
+      <w:pPr>
+        <w:tabs>
+          <w:tab w:val="num" w:pos="2880"/>
+        </w:tabs>
+        <w:ind w:left="2880" w:hanging="360"/>
+      </w:pPr>
+      <w:rPr>
+        <w:rFonts w:ascii="Wingdings" w:hAnsi="Wingdings" w:hint="default"/>
+        <w:sz w:val="20"/>
+      </w:rPr>
+    </w:lvl>
+    <w:lvl w:ilvl="4" w:tentative="1">
+      <w:start w:val="1"/>
+      <w:numFmt w:val="bullet"/>
+      <w:lvlText w:val=""/>
+      <w:lvlJc w:val="left"/>
+      <w:pPr>
+        <w:tabs>
+          <w:tab w:val="num" w:pos="3600"/>
+        </w:tabs>
+        <w:ind w:left="3600" w:hanging="360"/>
+      </w:pPr>
+      <w:rPr>
+        <w:rFonts w:ascii="Wingdings" w:hAnsi="Wingdings" w:hint="default"/>
+        <w:sz w:val="20"/>
+      </w:rPr>
+    </w:lvl>
+    <w:lvl w:ilvl="5" w:tentative="1">
+      <w:start w:val="1"/>
+      <w:numFmt w:val="bullet"/>
+      <w:lvlText w:val=""/>
+      <w:lvlJc w:val="left"/>
+      <w:pPr>
+        <w:tabs>
+          <w:tab w:val="num" w:pos="4320"/>
+        </w:tabs>
+        <w:ind w:left="4320" w:hanging="360"/>
+      </w:pPr>
+      <w:rPr>
+        <w:rFonts w:ascii="Wingdings" w:hAnsi="Wingdings" w:hint="default"/>
+        <w:sz w:val="20"/>
+      </w:rPr>
+    </w:lvl>
+    <w:lvl w:ilvl="6" w:tentative="1">
+      <w:start w:val="1"/>
+      <w:numFmt w:val="bullet"/>
+      <w:lvlText w:val=""/>
+      <w:lvlJc w:val="left"/>
+      <w:pPr>
+        <w:tabs>
+          <w:tab w:val="num" w:pos="5040"/>
+        </w:tabs>
+        <w:ind w:left="5040" w:hanging="360"/>
+      </w:pPr>
+      <w:rPr>
+        <w:rFonts w:ascii="Wingdings" w:hAnsi="Wingdings" w:hint="default"/>
+        <w:sz w:val="20"/>
+      </w:rPr>
+    </w:lvl>
+    <w:lvl w:ilvl="7" w:tentative="1">
+      <w:start w:val="1"/>
+      <w:numFmt w:val="bullet"/>
+      <w:lvlText w:val=""/>
+      <w:lvlJc w:val="left"/>
+      <w:pPr>
+        <w:tabs>
+          <w:tab w:val="num" w:pos="5760"/>
+        </w:tabs>
+        <w:ind w:left="5760" w:hanging="360"/>
+      </w:pPr>
+      <w:rPr>
+        <w:rFonts w:ascii="Wingdings" w:hAnsi="Wingdings" w:hint="default"/>
+        <w:sz w:val="20"/>
+      </w:rPr>
+    </w:lvl>
+    <w:lvl w:ilvl="8" w:tentative="1">
+      <w:start w:val="1"/>
+      <w:numFmt w:val="bullet"/>
+      <w:lvlText w:val=""/>
+      <w:lvlJc w:val="left"/>
+      <w:pPr>
+        <w:tabs>
+          <w:tab w:val="num" w:pos="6480"/>
+        </w:tabs>
+        <w:ind w:left="6480" w:hanging="360"/>
+      </w:pPr>
+      <w:rPr>
+        <w:rFonts w:ascii="Wingdings" w:hAnsi="Wingdings" w:hint="default"/>
+        <w:sz w:val="20"/>
+      </w:rPr>
+    </w:lvl>
+  </w:abstractNum>
+  <w:abstractNum w:abstractNumId="3" w15:restartNumberingAfterBreak="0">
+    <w:nsid w:val="363E240E"/>
+    <w:multiLevelType w:val="multilevel"/>
+    <w:tmpl w:val="A6904EE8"/>
+    <w:lvl w:ilvl="0">
+      <w:start w:val="1"/>
+      <w:numFmt w:val="bullet"/>
+      <w:lvlText w:val=""/>
+      <w:lvlJc w:val="left"/>
+      <w:pPr>
+        <w:tabs>
+          <w:tab w:val="num" w:pos="720"/>
+        </w:tabs>
+        <w:ind w:left="720" w:hanging="360"/>
+      </w:pPr>
+      <w:rPr>
+        <w:rFonts w:ascii="Symbol" w:hAnsi="Symbol" w:hint="default"/>
+        <w:sz w:val="20"/>
+      </w:rPr>
+    </w:lvl>
+    <w:lvl w:ilvl="1">
+      <w:start w:val="1"/>
+      <w:numFmt w:val="bullet"/>
+      <w:lvlText w:val="o"/>
+      <w:lvlJc w:val="left"/>
+      <w:pPr>
+        <w:tabs>
+          <w:tab w:val="num" w:pos="1440"/>
+        </w:tabs>
+        <w:ind w:left="1440" w:hanging="360"/>
+      </w:pPr>
+      <w:rPr>
+        <w:rFonts w:ascii="Courier New" w:hAnsi="Courier New" w:hint="default"/>
+        <w:sz w:val="20"/>
+      </w:rPr>
+    </w:lvl>
+    <w:lvl w:ilvl="2" w:tentative="1">
+      <w:start w:val="1"/>
+      <w:numFmt w:val="bullet"/>
+      <w:lvlText w:val=""/>
+      <w:lvlJc w:val="left"/>
+      <w:pPr>
+        <w:tabs>
+          <w:tab w:val="num" w:pos="2160"/>
+        </w:tabs>
+        <w:ind w:left="2160" w:hanging="360"/>
+      </w:pPr>
+      <w:rPr>
+        <w:rFonts w:ascii="Wingdings" w:hAnsi="Wingdings" w:hint="default"/>
+        <w:sz w:val="20"/>
+      </w:rPr>
+    </w:lvl>
+    <w:lvl w:ilvl="3" w:tentative="1">
+      <w:start w:val="1"/>
+      <w:numFmt w:val="bullet"/>
+      <w:lvlText w:val=""/>
+      <w:lvlJc w:val="left"/>
+      <w:pPr>
+        <w:tabs>
+          <w:tab w:val="num" w:pos="2880"/>
+        </w:tabs>
+        <w:ind w:left="2880" w:hanging="360"/>
+      </w:pPr>
+      <w:rPr>
+        <w:rFonts w:ascii="Wingdings" w:hAnsi="Wingdings" w:hint="default"/>
+        <w:sz w:val="20"/>
+      </w:rPr>
+    </w:lvl>
+    <w:lvl w:ilvl="4" w:tentative="1">
+      <w:start w:val="1"/>
+      <w:numFmt w:val="bullet"/>
+      <w:lvlText w:val=""/>
+      <w:lvlJc w:val="left"/>
+      <w:pPr>
+        <w:tabs>
+          <w:tab w:val="num" w:pos="3600"/>
+        </w:tabs>
+        <w:ind w:left="3600" w:hanging="360"/>
+      </w:pPr>
+      <w:rPr>
+        <w:rFonts w:ascii="Wingdings" w:hAnsi="Wingdings" w:hint="default"/>
+        <w:sz w:val="20"/>
+      </w:rPr>
+    </w:lvl>
+    <w:lvl w:ilvl="5" w:tentative="1">
+      <w:start w:val="1"/>
+      <w:numFmt w:val="bullet"/>
+      <w:lvlText w:val=""/>
+      <w:lvlJc w:val="left"/>
+      <w:pPr>
+        <w:tabs>
+          <w:tab w:val="num" w:pos="4320"/>
+        </w:tabs>
+        <w:ind w:left="4320" w:hanging="360"/>
+      </w:pPr>
+      <w:rPr>
+        <w:rFonts w:ascii="Wingdings" w:hAnsi="Wingdings" w:hint="default"/>
+        <w:sz w:val="20"/>
+      </w:rPr>
+    </w:lvl>
+    <w:lvl w:ilvl="6" w:tentative="1">
+      <w:start w:val="1"/>
+      <w:numFmt w:val="bullet"/>
+      <w:lvlText w:val=""/>
+      <w:lvlJc w:val="left"/>
+      <w:pPr>
+        <w:tabs>
+          <w:tab w:val="num" w:pos="5040"/>
+        </w:tabs>
+        <w:ind w:left="5040" w:hanging="360"/>
+      </w:pPr>
+      <w:rPr>
+        <w:rFonts w:ascii="Wingdings" w:hAnsi="Wingdings" w:hint="default"/>
+        <w:sz w:val="20"/>
+      </w:rPr>
+    </w:lvl>
+    <w:lvl w:ilvl="7" w:tentative="1">
+      <w:start w:val="1"/>
+      <w:numFmt w:val="bullet"/>
+      <w:lvlText w:val=""/>
+      <w:lvlJc w:val="left"/>
+      <w:pPr>
+        <w:tabs>
+          <w:tab w:val="num" w:pos="5760"/>
+        </w:tabs>
+        <w:ind w:left="5760" w:hanging="360"/>
+      </w:pPr>
+      <w:rPr>
+        <w:rFonts w:ascii="Wingdings" w:hAnsi="Wingdings" w:hint="default"/>
+        <w:sz w:val="20"/>
+      </w:rPr>
+    </w:lvl>
+    <w:lvl w:ilvl="8" w:tentative="1">
+      <w:start w:val="1"/>
+      <w:numFmt w:val="bullet"/>
+      <w:lvlText w:val=""/>
+      <w:lvlJc w:val="left"/>
+      <w:pPr>
+        <w:tabs>
+          <w:tab w:val="num" w:pos="6480"/>
+        </w:tabs>
+        <w:ind w:left="6480" w:hanging="360"/>
+      </w:pPr>
+      <w:rPr>
+        <w:rFonts w:ascii="Wingdings" w:hAnsi="Wingdings" w:hint="default"/>
+        <w:sz w:val="20"/>
+      </w:rPr>
+    </w:lvl>
+  </w:abstractNum>
+  <w:abstractNum w:abstractNumId="4" w15:restartNumberingAfterBreak="0">
     <w:nsid w:val="374762E2"/>
     <w:multiLevelType w:val="multilevel"/>
     <w:tmpl w:val="92E8635A"/>
@@ -1253,7 +1892,156 @@
       </w:rPr>
     </w:lvl>
   </w:abstractNum>
-  <w:abstractNum w:abstractNumId="3" w15:restartNumberingAfterBreak="0">
+  <w:abstractNum w:abstractNumId="5" w15:restartNumberingAfterBreak="0">
+    <w:nsid w:val="68E90891"/>
+    <w:multiLevelType w:val="multilevel"/>
+    <w:tmpl w:val="AFDAF138"/>
+    <w:lvl w:ilvl="0">
+      <w:start w:val="1"/>
+      <w:numFmt w:val="bullet"/>
+      <w:lvlText w:val=""/>
+      <w:lvlJc w:val="left"/>
+      <w:pPr>
+        <w:tabs>
+          <w:tab w:val="num" w:pos="720"/>
+        </w:tabs>
+        <w:ind w:left="720" w:hanging="360"/>
+      </w:pPr>
+      <w:rPr>
+        <w:rFonts w:ascii="Symbol" w:hAnsi="Symbol" w:hint="default"/>
+        <w:sz w:val="20"/>
+      </w:rPr>
+    </w:lvl>
+    <w:lvl w:ilvl="1" w:tentative="1">
+      <w:start w:val="1"/>
+      <w:numFmt w:val="bullet"/>
+      <w:lvlText w:val="o"/>
+      <w:lvlJc w:val="left"/>
+      <w:pPr>
+        <w:tabs>
+          <w:tab w:val="num" w:pos="1440"/>
+        </w:tabs>
+        <w:ind w:left="1440" w:hanging="360"/>
+      </w:pPr>
+      <w:rPr>
+        <w:rFonts w:ascii="Courier New" w:hAnsi="Courier New" w:hint="default"/>
+        <w:sz w:val="20"/>
+      </w:rPr>
+    </w:lvl>
+    <w:lvl w:ilvl="2" w:tentative="1">
+      <w:start w:val="1"/>
+      <w:numFmt w:val="bullet"/>
+      <w:lvlText w:val=""/>
+      <w:lvlJc w:val="left"/>
+      <w:pPr>
+        <w:tabs>
+          <w:tab w:val="num" w:pos="2160"/>
+        </w:tabs>
+        <w:ind w:left="2160" w:hanging="360"/>
+      </w:pPr>
+      <w:rPr>
+        <w:rFonts w:ascii="Wingdings" w:hAnsi="Wingdings" w:hint="default"/>
+        <w:sz w:val="20"/>
+      </w:rPr>
+    </w:lvl>
+    <w:lvl w:ilvl="3" w:tentative="1">
+      <w:start w:val="1"/>
+      <w:numFmt w:val="bullet"/>
+      <w:lvlText w:val=""/>
+      <w:lvlJc w:val="left"/>
+      <w:pPr>
+        <w:tabs>
+          <w:tab w:val="num" w:pos="2880"/>
+        </w:tabs>
+        <w:ind w:left="2880" w:hanging="360"/>
+      </w:pPr>
+      <w:rPr>
+        <w:rFonts w:ascii="Wingdings" w:hAnsi="Wingdings" w:hint="default"/>
+        <w:sz w:val="20"/>
+      </w:rPr>
+    </w:lvl>
+    <w:lvl w:ilvl="4" w:tentative="1">
+      <w:start w:val="1"/>
+      <w:numFmt w:val="bullet"/>
+      <w:lvlText w:val=""/>
+      <w:lvlJc w:val="left"/>
+      <w:pPr>
+        <w:tabs>
+          <w:tab w:val="num" w:pos="3600"/>
+        </w:tabs>
+        <w:ind w:left="3600" w:hanging="360"/>
+      </w:pPr>
+      <w:rPr>
+        <w:rFonts w:ascii="Wingdings" w:hAnsi="Wingdings" w:hint="default"/>
+        <w:sz w:val="20"/>
+      </w:rPr>
+    </w:lvl>
+    <w:lvl w:ilvl="5" w:tentative="1">
+      <w:start w:val="1"/>
+      <w:numFmt w:val="bullet"/>
+      <w:lvlText w:val=""/>
+      <w:lvlJc w:val="left"/>
+      <w:pPr>
+        <w:tabs>
+          <w:tab w:val="num" w:pos="4320"/>
+        </w:tabs>
+        <w:ind w:left="4320" w:hanging="360"/>
+      </w:pPr>
+      <w:rPr>
+        <w:rFonts w:ascii="Wingdings" w:hAnsi="Wingdings" w:hint="default"/>
+        <w:sz w:val="20"/>
+      </w:rPr>
+    </w:lvl>
+    <w:lvl w:ilvl="6" w:tentative="1">
+      <w:start w:val="1"/>
+      <w:numFmt w:val="bullet"/>
+      <w:lvlText w:val=""/>
+      <w:lvlJc w:val="left"/>
+      <w:pPr>
+        <w:tabs>
+          <w:tab w:val="num" w:pos="5040"/>
+        </w:tabs>
+        <w:ind w:left="5040" w:hanging="360"/>
+      </w:pPr>
+      <w:rPr>
+        <w:rFonts w:ascii="Wingdings" w:hAnsi="Wingdings" w:hint="default"/>
+        <w:sz w:val="20"/>
+      </w:rPr>
+    </w:lvl>
+    <w:lvl w:ilvl="7" w:tentative="1">
+      <w:start w:val="1"/>
+      <w:numFmt w:val="bullet"/>
+      <w:lvlText w:val=""/>
+      <w:lvlJc w:val="left"/>
+      <w:pPr>
+        <w:tabs>
+          <w:tab w:val="num" w:pos="5760"/>
+        </w:tabs>
+        <w:ind w:left="5760" w:hanging="360"/>
+      </w:pPr>
+      <w:rPr>
+        <w:rFonts w:ascii="Wingdings" w:hAnsi="Wingdings" w:hint="default"/>
+        <w:sz w:val="20"/>
+      </w:rPr>
+    </w:lvl>
+    <w:lvl w:ilvl="8" w:tentative="1">
+      <w:start w:val="1"/>
+      <w:numFmt w:val="bullet"/>
+      <w:lvlText w:val=""/>
+      <w:lvlJc w:val="left"/>
+      <w:pPr>
+        <w:tabs>
+          <w:tab w:val="num" w:pos="6480"/>
+        </w:tabs>
+        <w:ind w:left="6480" w:hanging="360"/>
+      </w:pPr>
+      <w:rPr>
+        <w:rFonts w:ascii="Wingdings" w:hAnsi="Wingdings" w:hint="default"/>
+        <w:sz w:val="20"/>
+      </w:rPr>
+    </w:lvl>
+  </w:abstractNum>
+  <w:abstractNum w:abstractNumId="6" w15:restartNumberingAfterBreak="0">
     <w:nsid w:val="769E5298"/>
     <w:multiLevelType w:val="multilevel"/>
     <w:tmpl w:val="B9929F30"/>
@@ -1402,7 +2190,7 @@
       </w:rPr>
     </w:lvl>
   </w:abstractNum>
-  <w:abstractNum w:abstractNumId="4" w15:restartNumberingAfterBreak="0">
+  <w:abstractNum w:abstractNumId="7" w15:restartNumberingAfterBreak="0">
     <w:nsid w:val="79713871"/>
     <w:multiLevelType w:val="multilevel"/>
     <w:tmpl w:val="181A00DA"/>
@@ -1552,7 +2340,7 @@
     </w:lvl>
   </w:abstractNum>
   <w:num w:numId="1" w16cid:durableId="2013557063">
-    <w:abstractNumId w:val="2"/>
+    <w:abstractNumId w:val="4"/>
   </w:num>
   <w:num w:numId="2" w16cid:durableId="1583946883">
     <w:abstractNumId w:val="0"/>
@@ -1561,10 +2349,19 @@
     <w:abstractNumId w:val="1"/>
   </w:num>
   <w:num w:numId="4" w16cid:durableId="2134402784">
-    <w:abstractNumId w:val="4"/>
+    <w:abstractNumId w:val="7"/>
   </w:num>
   <w:num w:numId="5" w16cid:durableId="924925218">
+    <w:abstractNumId w:val="6"/>
+  </w:num>
+  <w:num w:numId="6" w16cid:durableId="1088380832">
+    <w:abstractNumId w:val="5"/>
+  </w:num>
+  <w:num w:numId="7" w16cid:durableId="1316106157">
     <w:abstractNumId w:val="3"/>
+  </w:num>
+  <w:num w:numId="8" w16cid:durableId="1927105399">
+    <w:abstractNumId w:val="2"/>
   </w:num>
 </w:numbering>
 </file>
@@ -2172,7 +2969,6 @@
   <w:style w:type="character" w:default="1" w:styleId="DefaultParagraphFont">
     <w:name w:val="Default Paragraph Font"/>
     <w:uiPriority w:val="1"/>
-    <w:semiHidden/>
     <w:unhideWhenUsed/>
   </w:style>
   <w:style w:type="table" w:default="1" w:styleId="TableNormal">
@@ -2490,7 +3286,6 @@
     <w:name w:val="Normal (Web)"/>
     <w:basedOn w:val="Normal"/>
     <w:uiPriority w:val="99"/>
-    <w:semiHidden/>
     <w:unhideWhenUsed/>
     <w:rsid w:val="00B060C5"/>
     <w:pPr>
@@ -2833,21 +3628,6 @@
 </file>
 
 <file path=customXml/item1.xml><?xml version="1.0" encoding="utf-8"?>
-<p:properties xmlns:p="http://schemas.microsoft.com/office/2006/metadata/properties" xmlns:xsi="http://www.w3.org/2001/XMLSchema-instance" xmlns:pc="http://schemas.microsoft.com/office/infopath/2007/PartnerControls">
-  <documentManagement/>
-</p:properties>
-</file>
-
-<file path=customXml/item2.xml><?xml version="1.0" encoding="utf-8"?>
-<?mso-contentType ?>
-<FormTemplates xmlns="http://schemas.microsoft.com/sharepoint/v3/contenttype/forms">
-  <Display>DocumentLibraryForm</Display>
-  <Edit>DocumentLibraryForm</Edit>
-  <New>DocumentLibraryForm</New>
-</FormTemplates>
-</file>
-
-<file path=customXml/item3.xml><?xml version="1.0" encoding="utf-8"?>
 <ct:contentTypeSchema xmlns:ct="http://schemas.microsoft.com/office/2006/metadata/contentType" xmlns:ma="http://schemas.microsoft.com/office/2006/metadata/properties/metaAttributes" ct:_="" ma:_="" ma:contentTypeName="Document" ma:contentTypeID="0x0101001023D0E0A5CFF3458A71815FC1A988FB" ma:contentTypeVersion="8" ma:contentTypeDescription="Een nieuw document maken." ma:contentTypeScope="" ma:versionID="02bc9a362714565d8368c45dcd05fa1b">
   <xsd:schema xmlns:xsd="http://www.w3.org/2001/XMLSchema" xmlns:xs="http://www.w3.org/2001/XMLSchema" xmlns:p="http://schemas.microsoft.com/office/2006/metadata/properties" xmlns:ns3="70ee6563-7014-41ce-bf4a-45396fb5097c" targetNamespace="http://schemas.microsoft.com/office/2006/metadata/properties" ma:root="true" ma:fieldsID="ca51d1c08108de9ba74850ec11298af2" ns3:_="">
     <xsd:import namespace="70ee6563-7014-41ce-bf4a-45396fb5097c"/>
@@ -3017,24 +3797,22 @@
 </ct:contentTypeSchema>
 </file>
 
-<file path=customXml/itemProps1.xml><?xml version="1.0" encoding="utf-8"?>
-<ds:datastoreItem xmlns:ds="http://schemas.openxmlformats.org/officeDocument/2006/customXml" ds:itemID="{E64BE24E-0965-4DEE-ADB2-C0BA48717341}">
-  <ds:schemaRefs>
-    <ds:schemaRef ds:uri="http://schemas.microsoft.com/office/2006/metadata/properties"/>
-    <ds:schemaRef ds:uri="http://schemas.microsoft.com/office/infopath/2007/PartnerControls"/>
-  </ds:schemaRefs>
-</ds:datastoreItem>
+<file path=customXml/item2.xml><?xml version="1.0" encoding="utf-8"?>
+<?mso-contentType ?>
+<FormTemplates xmlns="http://schemas.microsoft.com/sharepoint/v3/contenttype/forms">
+  <Display>DocumentLibraryForm</Display>
+  <Edit>DocumentLibraryForm</Edit>
+  <New>DocumentLibraryForm</New>
+</FormTemplates>
 </file>
 
-<file path=customXml/itemProps2.xml><?xml version="1.0" encoding="utf-8"?>
-<ds:datastoreItem xmlns:ds="http://schemas.openxmlformats.org/officeDocument/2006/customXml" ds:itemID="{6D75E6A7-F918-4DB1-8CE5-B430D74BB28C}">
-  <ds:schemaRefs>
-    <ds:schemaRef ds:uri="http://schemas.microsoft.com/sharepoint/v3/contenttype/forms"/>
-  </ds:schemaRefs>
-</ds:datastoreItem>
+<file path=customXml/item3.xml><?xml version="1.0" encoding="utf-8"?>
+<p:properties xmlns:p="http://schemas.microsoft.com/office/2006/metadata/properties" xmlns:xsi="http://www.w3.org/2001/XMLSchema-instance" xmlns:pc="http://schemas.microsoft.com/office/infopath/2007/PartnerControls">
+  <documentManagement/>
+</p:properties>
 </file>
 
-<file path=customXml/itemProps3.xml><?xml version="1.0" encoding="utf-8"?>
+<file path=customXml/itemProps1.xml><?xml version="1.0" encoding="utf-8"?>
 <ds:datastoreItem xmlns:ds="http://schemas.openxmlformats.org/officeDocument/2006/customXml" ds:itemID="{F6C49426-DA2D-4857-A48E-B639C615AE29}">
   <ds:schemaRefs>
     <ds:schemaRef ds:uri="http://schemas.microsoft.com/office/2006/metadata/contentType"/>
@@ -3050,4 +3828,21 @@
     <ds:schemaRef ds:uri="http://schemas.microsoft.com/internal/obd"/>
   </ds:schemaRefs>
 </ds:datastoreItem>
+</file>
+
+<file path=customXml/itemProps2.xml><?xml version="1.0" encoding="utf-8"?>
+<ds:datastoreItem xmlns:ds="http://schemas.openxmlformats.org/officeDocument/2006/customXml" ds:itemID="{6D75E6A7-F918-4DB1-8CE5-B430D74BB28C}">
+  <ds:schemaRefs>
+    <ds:schemaRef ds:uri="http://schemas.microsoft.com/sharepoint/v3/contenttype/forms"/>
+  </ds:schemaRefs>
+</ds:datastoreItem>
+</file>
+
+<file path=customXml/itemProps3.xml><?xml version="1.0" encoding="utf-8"?>
+<ds:datastoreItem xmlns:ds="http://schemas.openxmlformats.org/officeDocument/2006/customXml" ds:itemID="{E64BE24E-0965-4DEE-ADB2-C0BA48717341}">
+  <ds:schemaRefs>
+    <ds:schemaRef ds:uri="http://schemas.microsoft.com/office/2006/metadata/properties"/>
+    <ds:schemaRef ds:uri="http://schemas.microsoft.com/office/infopath/2007/PartnerControls"/>
+  </ds:schemaRefs>
+</ds:datastoreItem>
 </file>
</xml_diff>